<commit_message>
Mensajes CM: arreglo del generador
Co-Authored-By: Claude Fable 5.1 <noreply@anthropic.com>
</commit_message>
<xml_diff>
--- a/recursos/comercial/contratacion/COMMUNITY_MANAGER/MENSAJES_PRUEBA_4_VIDEOS_CM_2026-10-20.docx
+++ b/recursos/comercial/contratacion/COMMUNITY_MANAGER/MENSAJES_PRUEBA_4_VIDEOS_CM_2026-10-20.docx
@@ -26,7 +26,7 @@
           <w:color w:val="666666"/>
           <w:sz w:val="18"/>
         </w:rPr>
-        <w:t>Uso interno. Adjuntar a cada uno PRUEBA_4_VIDEOS_CM.pdf y decirle su letra. Entrega: domingo 25 de octubre. Sin pago por la prueba; $100.000 si se publica. Asignación propuesta: A Kimberly · B Astrid (si responde bien las dos preguntas) · C Sebastián (si completa su información) · D Luna.</w:t>
+        <w:t>Uso interno. Adjuntar a cada uno PRUEBA_4_VIDEOS_CM.pdf y decirle su letra. Entrega: domingo 25 de octubre. Sin pago por la prueba; $100.000 si se publica. Se envía por correo a los cuatro a la vez, con el PDF adjunto; las preguntas pendientes van en el mismo correo, sin condicionar la prueba. Asignación: A Kimberly · B Astrid · C Sebastián · D Luna.</w:t>
       </w:r>
     </w:p>
     <w:p>
@@ -75,7 +75,7 @@
           <w:b w:val="0"/>
           <w:sz w:val="19"/>
         </w:rPr>
-        <w:t>El siguiente paso es una prueba práctica corta: un video de 20 segundos desde tu casa, con un tema que te asignamos (ficha A del documento adjunto) y las reglas de mensaje de la academia. Te soy transparente: la prueba no tiene pago, pero si publicamos tu video te pagamos $100.000 por la pieza, pases o no. Ahí verás que nuestro mensaje es distinto al habitual: no vendemos que el inglés sea fácil, vendemos entrenamiento con garantía por escrito.</w:t>
+        <w:t>El siguiente paso es una prueba práctica corta: un video de 20 segundos desde tu casa, con el tema de la ficha A del documento adjunto y las reglas de mensaje de la academia. Te soy transparente: la prueba no tiene pago, pero si publicamos tu video te pagamos $100.000 por la pieza, pases o no. Ahí verás que nuestro mensaje es distinto al habitual: no vendemos que el inglés sea fácil, vendemos entrenamiento con garantía por escrito.</w:t>
       </w:r>
     </w:p>
     <w:p>
@@ -87,7 +87,7 @@
           <w:b w:val="0"/>
           <w:sz w:val="19"/>
         </w:rPr>
-        <w:t>¿Te animas? La entrega sería el domingo 25 de octubre. Si ya no te interesa, me lo dices con confianza.</w:t>
+        <w:t>La entrega es el domingo 25 de octubre, a este mismo correo (adjunto o enlace). Las dudas, también por aquí. Si ya no te interesa, me lo dices con confianza.</w:t>
       </w:r>
     </w:p>
     <w:p>
@@ -138,7 +138,7 @@
           <w:b w:val="0"/>
           <w:sz w:val="19"/>
         </w:rPr>
-        <w:t>Para avanzar te pido dos cosas: tu hoja de vida con fechas (desde y hasta) de cada trabajo, y dos referencias (nombre, cargo y teléfono de un jefe o cliente para quien hayas hecho contenido o manejado redes).</w:t>
+        <w:t>El siguiente paso es una prueba práctica corta: un video de 20 segundos desde tu casa, con el tema de la ficha D del documento adjunto y las reglas de mensaje de la academia. Te soy transparente: la prueba no tiene pago, pero si publicamos tu video te pagamos $100.000 por la pieza, pases o no. La entrega es el domingo 25 de octubre, a este mismo correo (adjunto o enlace); las dudas, también por aquí.</w:t>
       </w:r>
     </w:p>
     <w:p>
@@ -150,19 +150,7 @@
           <w:b w:val="0"/>
           <w:sz w:val="19"/>
         </w:rPr>
-        <w:t>Y el siguiente paso, que puedes empezar ya: una prueba práctica corta, un video de 20 segundos desde tu casa con un tema que te asignamos (ficha D del documento adjunto) y las reglas de mensaje de la academia. Te soy transparente: la prueba no tiene pago, pero si publicamos tu video te pagamos $100.000 por la pieza, pases o no.</w:t>
-      </w:r>
-    </w:p>
-    <w:p>
-      <w:pPr>
-        <w:spacing w:after="80"/>
-      </w:pPr>
-      <w:r>
-        <w:rPr>
-          <w:b w:val="0"/>
-          <w:sz w:val="19"/>
-        </w:rPr>
-        <w:t>¿Me confirmas si te animas? La entrega sería el domingo 25 de octubre.</w:t>
+        <w:t>Y en el mismo correo de la entrega, por favor, tu hoja de vida con fechas (desde y hasta) de cada trabajo y dos referencias: nombre, cargo y teléfono de un jefe o cliente para quien hayas hecho contenido o manejado redes.</w:t>
       </w:r>
     </w:p>
     <w:p>
@@ -189,7 +177,7 @@
           <w:color w:val="E54C09"/>
           <w:sz w:val="22"/>
         </w:rPr>
-        <w:t>ASTRID (ficha B, solo si encaja)</w:t>
+        <w:t>ASTRID (ficha B)</w:t>
       </w:r>
     </w:p>
     <w:p>
@@ -213,7 +201,7 @@
           <w:b w:val="0"/>
           <w:sz w:val="19"/>
         </w:rPr>
-        <w:t>Antes de avanzar, dos preguntas de frente, porque de eso depende que el cargo te sirva: parte de lo que se graba es en las clases de la noche (6:30 a 8:30) y los sábados en la mañana; tu disponibilidad es hasta mediodía: ¿podrías cubrir al menos dos noches por semana en la academia? Y hoy manejas tres cuentas; este cargo cubre dos marcas y pide presencia en la academia varias veces por semana: ¿cómo lo ves en tiempo?</w:t>
+        <w:t>El siguiente paso es una prueba práctica corta: un video de 20 segundos desde tu casa, con el tema de la ficha B del documento adjunto y las reglas de mensaje de la academia. Te soy transparente: la prueba no tiene pago, pero si publicamos tu video te pagamos $100.000 por la pieza, pases o no. La entrega es el domingo 25 de octubre, a este mismo correo (adjunto o enlace); las dudas, también por aquí.</w:t>
       </w:r>
     </w:p>
     <w:p>
@@ -225,7 +213,7 @@
           <w:b w:val="0"/>
           <w:sz w:val="19"/>
         </w:rPr>
-        <w:t>Una aclaración sobre los testimonios: aquí siempre salen con la persona real, su cara y su voz, porque es lo que respalda la garantía que firmamos; no usamos avatares de IA para eso.</w:t>
+        <w:t>Y dos preguntas de frente, para responder en el mismo correo, porque de eso depende que el cargo te sirva: parte de lo que se graba es en las clases de la noche (6:30 a 8:30) y los sábados en la mañana, y tu disponibilidad es hasta mediodía: ¿podrías cubrir al menos dos noches por semana en la academia? Y hoy manejas tres cuentas; este cargo cubre dos marcas y pide presencia en la academia varias veces por semana: ¿cómo lo ves en tiempo?</w:t>
       </w:r>
     </w:p>
     <w:p>
@@ -237,7 +225,7 @@
           <w:b w:val="0"/>
           <w:sz w:val="19"/>
         </w:rPr>
-        <w:t>Si las dos respuestas encajan, el siguiente paso es una prueba práctica corta: un video de 20 segundos desde tu casa con un tema asignado (ficha B del documento adjunto). La prueba no tiene pago; si publicamos tu video te pagamos $100.000 por la pieza. Entrega el domingo 25 de octubre. ¿Me cuentas?</w:t>
+        <w:t>Una aclaración sobre los testimonios: aquí siempre salen con la persona real, su cara y su voz, porque es lo que respalda la garantía que firmamos; no usamos avatares de IA para eso. En la prueba también: sales tú o alguien real.</w:t>
       </w:r>
     </w:p>
     <w:p>
@@ -264,7 +252,7 @@
           <w:color w:val="E54C09"/>
           <w:sz w:val="22"/>
         </w:rPr>
-        <w:t>SEBASTIÁN (ficha C, cuando complete su información)</w:t>
+        <w:t>SEBASTIÁN (ficha C)</w:t>
       </w:r>
     </w:p>
     <w:p>
@@ -276,7 +264,19 @@
           <w:b w:val="0"/>
           <w:sz w:val="19"/>
         </w:rPr>
-        <w:t>Hola Sebastián, retomo tu postulación. Te había pedido las fechas de tus trabajos, dos referencias y enlaces a cuentas o videos publicados; si me los compartes, pasamos al siguiente paso: una prueba práctica corta, un video de 20 segundos desde tu casa con un tema asignado (ficha C del documento adjunto) y las reglas de mensaje de la academia. La prueba no tiene pago; si publicamos tu video te pagamos $100.000 por la pieza, pases o no. Entrega el domingo 25 de octubre. ¿Te animas?</w:t>
+        <w:t>Hola Sebastián, retomo tu postulación y te pido disculpas por la demora. El siguiente paso es una prueba práctica corta: un video de 20 segundos desde tu casa, con el tema de la ficha C del documento adjunto y las reglas de mensaje de la academia. Te soy transparente: la prueba no tiene pago, pero si publicamos tu video te pagamos $100.000 por la pieza, pases o no. La entrega es el domingo 25 de octubre, a este mismo correo (adjunto o enlace); las dudas, también por aquí.</w:t>
+      </w:r>
+    </w:p>
+    <w:p>
+      <w:pPr>
+        <w:spacing w:after="80"/>
+      </w:pPr>
+      <w:r>
+        <w:rPr>
+          <w:b w:val="0"/>
+          <w:sz w:val="19"/>
+        </w:rPr>
+        <w:t>En el mismo correo de la entrega, por favor: las fechas (desde y hasta) de tus trabajos en Star Market, Even Company y La Gente de la Cámara; dos referencias (nombre, cargo y teléfono de un jefe o cliente para quien hayas trabajado en contenido o redes); y enlaces a cuentas que hayas manejado o a videos tuyos publicados.</w:t>
       </w:r>
     </w:p>
     <w:p>

</xml_diff>

<commit_message>
Mensaje CM a Sebastian: ya envio su informacion; prueba ficha C
Co-Authored-By: Claude Fable 5.1 <noreply@anthropic.com>
</commit_message>
<xml_diff>
--- a/recursos/comercial/contratacion/COMMUNITY_MANAGER/MENSAJES_PRUEBA_4_VIDEOS_CM_2026-10-20.docx
+++ b/recursos/comercial/contratacion/COMMUNITY_MANAGER/MENSAJES_PRUEBA_4_VIDEOS_CM_2026-10-20.docx
@@ -264,7 +264,7 @@
           <w:b w:val="0"/>
           <w:sz w:val="19"/>
         </w:rPr>
-        <w:t>Hola Sebastián, retomo tu postulación y te pido disculpas por la demora. El siguiente paso es una prueba práctica corta: un video de 20 segundos desde tu casa, con el tema de la ficha C del documento adjunto y las reglas de mensaje de la academia. Te soy transparente: la prueba no tiene pago, pero si publicamos tu video te pagamos $100.000 por la pieza, pases o no. La entrega es el domingo 25 de octubre, a este mismo correo (adjunto o enlace); las dudas, también por aquí.</w:t>
+        <w:t>Hola Sebastián, gracias por la información, las referencias y los enlaces; una sola duda: las fechas de enero a julio de 2025, ¿son de cuál de los tres trabajos? Me lo cuentas en la respuesta.</w:t>
       </w:r>
     </w:p>
     <w:p>
@@ -276,7 +276,19 @@
           <w:b w:val="0"/>
           <w:sz w:val="19"/>
         </w:rPr>
-        <w:t>En el mismo correo de la entrega, por favor: las fechas (desde y hasta) de tus trabajos en Star Market, Even Company y La Gente de la Cámara; dos referencias (nombre, cargo y teléfono de un jefe o cliente para quien hayas trabajado en contenido o redes); y enlaces a cuentas que hayas manejado o a videos tuyos publicados.</w:t>
+        <w:t>El siguiente paso es una prueba práctica corta: un video de 20 segundos desde tu casa, con el tema de la ficha C del documento adjunto y las reglas de mensaje de la academia. Te soy transparente: la prueba no tiene pago, pero si publicamos tu video te pagamos $100.000 por la pieza, pases o no. Vas a ver que nuestro mensaje es distinto al de venta directa: no vendemos que el inglés sea fácil, vendemos entrenamiento con garantía por escrito; la prueba es justamente ver cómo cambias de registro.</w:t>
+      </w:r>
+    </w:p>
+    <w:p>
+      <w:pPr>
+        <w:spacing w:after="80"/>
+      </w:pPr>
+      <w:r>
+        <w:rPr>
+          <w:b w:val="0"/>
+          <w:sz w:val="19"/>
+        </w:rPr>
+        <w:t>La entrega es el domingo 25 de octubre, a este mismo correo (adjunto o enlace); las dudas, también por aquí.</w:t>
       </w:r>
     </w:p>
     <w:p>

</xml_diff>

<commit_message>
Mensajes CM a Luna y Astrid con disculpa por la demora
Co-Authored-By: Claude Fable 5.1 <noreply@anthropic.com>
</commit_message>
<xml_diff>
--- a/recursos/comercial/contratacion/COMMUNITY_MANAGER/MENSAJES_PRUEBA_4_VIDEOS_CM_2026-10-20.docx
+++ b/recursos/comercial/contratacion/COMMUNITY_MANAGER/MENSAJES_PRUEBA_4_VIDEOS_CM_2026-10-20.docx
@@ -126,7 +126,7 @@
           <w:b w:val="0"/>
           <w:sz w:val="19"/>
         </w:rPr>
-        <w:t>Hola Luna, gracias por tu postulación, por el portafolio y por el video. Nos gustó tu respuesta sobre los testimonios: conversación cercana y preguntas sencillas es exactamente como los hacemos aquí.</w:t>
+        <w:t>Hola Luna, te pido disculpas por la demora en responderte: arrancamos un cargo nuevo esta semana y se me corrió todo. Gracias por tu postulación, por el portafolio y por el video. Nos gustó tu respuesta sobre los testimonios: conversación cercana y preguntas sencillas es exactamente como los hacemos aquí.</w:t>
       </w:r>
     </w:p>
     <w:p>
@@ -189,7 +189,7 @@
           <w:b w:val="0"/>
           <w:sz w:val="19"/>
         </w:rPr>
-        <w:t>Hola Astrid, gracias por tu postulación, por el portafolio y por los videos. Se nota oficio.</w:t>
+        <w:t>Hola Astrid, te pido disculpas por la demora en responderte: arrancamos un cargo nuevo esta semana y se me corrió todo. Gracias por tu postulación, por el portafolio y por los videos. Se nota oficio.</w:t>
       </w:r>
     </w:p>
     <w:p>

</xml_diff>